<commit_message>
chore(st4): reorganize ST4 scripts into tests/stress/st4 and sync docs
- Move all st4_p* scripts into tests/stress/st4/ for proper test layout
- Remove screenshots from repo root (build artifacts)
- Sync .gitignore, PHASE4_ROADMAP, user manual docx/pdf/md
- Include ST4 Phase 6/7 playbook
</commit_message>
<xml_diff>
--- a/docs/TaxFlow-Pro-v3.11.6-User-Manual.docx
+++ b/docs/TaxFlow-Pro-v3.11.6-User-Manual.docx
@@ -4116,7 +4116,7 @@
         <w:pStyle w:val="Heading3"/>
       </w:pPr>
       <w:r>
-        <w:t>24.1 How it works</w:t>
+        <w:t>24.1 What it does</w:t>
       </w:r>
     </w:p>
     <w:p>
@@ -4124,7 +4124,7 @@
         <w:spacing w:after="120"/>
       </w:pPr>
       <w:r>
-        <w:t>TaxFlow Pro can train a local text classifier on your own categorized transactions. The model learns from descriptions you have already labeled and suggests categories for new transactions.</w:t>
+        <w:t>The Machine Learning feature looks at transaction descriptions you have already categorized and tries to guess the right category for new transactions. It runs entirely on your computer.</w:t>
       </w:r>
     </w:p>
     <w:p>
@@ -4132,52 +4132,168 @@
         <w:pStyle w:val="Heading3"/>
       </w:pPr>
       <w:r>
-        <w:t>24.2 Train the model</w:t>
-      </w:r>
-    </w:p>
-    <w:p>
-      <w:pPr>
-        <w:pStyle w:val="ListNumber"/>
+        <w:t>24.2 When it is trustworthy</w:t>
+      </w:r>
+    </w:p>
+    <w:p>
+      <w:pPr>
+        <w:spacing w:after="120"/>
+      </w:pPr>
+      <w:r>
+        <w:t>Machine learning needs examples. A brand-new model trained on only a handful of transactions is basically guessing. This is normal, not a bug.</w:t>
+      </w:r>
+    </w:p>
+    <w:p>
+      <w:pPr>
+        <w:spacing w:after="120"/>
+      </w:pPr>
+      <w:r>
+        <w:t>Use this rule of thumb:</w:t>
+      </w:r>
+    </w:p>
+    <w:p>
+      <w:pPr>
+        <w:pStyle w:val="ListBullet"/>
         <w:spacing w:after="80"/>
       </w:pPr>
-      <w:r>
-        <w:t xml:space="preserve">Go to the </w:t>
-      </w:r>
       <w:r>
         <w:rPr>
           <w:b/>
         </w:rPr>
-        <w:t>Machine Learning</w:t>
-      </w:r>
-      <w:r>
-        <w:t xml:space="preserve"> section on the landing page.</w:t>
-      </w:r>
-    </w:p>
-    <w:p>
-      <w:pPr>
-        <w:pStyle w:val="ListNumber"/>
+        <w:t>Under 50 labeled transactions:</w:t>
+      </w:r>
+      <w:r>
+        <w:t xml:space="preserve"> Do not rely on ML. Use categorization rules and manual review.</w:t>
+      </w:r>
+    </w:p>
+    <w:p>
+      <w:pPr>
+        <w:pStyle w:val="ListBullet"/>
         <w:spacing w:after="80"/>
       </w:pPr>
-      <w:r>
-        <w:t>Make sure you have at least 10 manually categorized transactions.</w:t>
-      </w:r>
-    </w:p>
-    <w:p>
-      <w:pPr>
-        <w:pStyle w:val="ListNumber"/>
-        <w:spacing w:after="80"/>
-      </w:pPr>
-      <w:r>
-        <w:t xml:space="preserve">Click </w:t>
-      </w:r>
       <w:r>
         <w:rPr>
           <w:b/>
         </w:rPr>
-        <w:t>Train Model</w:t>
-      </w:r>
-      <w:r>
-        <w:t>.</w:t>
+        <w:t>50–100 labeled transactions:</w:t>
+      </w:r>
+      <w:r>
+        <w:t xml:space="preserve"> ML may help, but review its suggestions closely.</w:t>
+      </w:r>
+    </w:p>
+    <w:p>
+      <w:pPr>
+        <w:pStyle w:val="ListBullet"/>
+        <w:spacing w:after="80"/>
+      </w:pPr>
+      <w:r>
+        <w:rPr>
+          <w:b/>
+        </w:rPr>
+        <w:t>100–500 labeled transactions:</w:t>
+      </w:r>
+      <w:r>
+        <w:t xml:space="preserve"> ML is usually reliable for common, repeated merchants.</w:t>
+      </w:r>
+    </w:p>
+    <w:p>
+      <w:pPr>
+        <w:pStyle w:val="ListBullet"/>
+        <w:spacing w:after="80"/>
+      </w:pPr>
+      <w:r>
+        <w:rPr>
+          <w:b/>
+        </w:rPr>
+        <w:t>500+ labeled transactions:</w:t>
+      </w:r>
+      <w:r>
+        <w:t xml:space="preserve"> ML can handle most routine categorization.</w:t>
+      </w:r>
+    </w:p>
+    <w:p>
+      <w:pPr>
+        <w:spacing w:after="120"/>
+      </w:pPr>
+      <w:r>
+        <w:t xml:space="preserve">Accuracy also matters. Look at the </w:t>
+      </w:r>
+      <w:r>
+        <w:rPr>
+          <w:b/>
+        </w:rPr>
+        <w:t>Overall Accuracy</w:t>
+      </w:r>
+      <w:r>
+        <w:t xml:space="preserve"> shown in the ML Model Management panel:</w:t>
+      </w:r>
+    </w:p>
+    <w:p>
+      <w:pPr>
+        <w:pStyle w:val="ListBullet"/>
+        <w:spacing w:after="80"/>
+      </w:pPr>
+      <w:r>
+        <w:rPr>
+          <w:b/>
+        </w:rPr>
+        <w:t>Below 60%:</w:t>
+      </w:r>
+      <w:r>
+        <w:t xml:space="preserve"> The model is not useful yet. Label more transactions and retrain.</w:t>
+      </w:r>
+    </w:p>
+    <w:p>
+      <w:pPr>
+        <w:pStyle w:val="ListBullet"/>
+        <w:spacing w:after="80"/>
+      </w:pPr>
+      <w:r>
+        <w:rPr>
+          <w:b/>
+        </w:rPr>
+        <w:t>60–80%:</w:t>
+      </w:r>
+      <w:r>
+        <w:t xml:space="preserve"> Useful but error-prone. Use it as a helper, not the final word.</w:t>
+      </w:r>
+    </w:p>
+    <w:p>
+      <w:pPr>
+        <w:pStyle w:val="ListBullet"/>
+        <w:spacing w:after="80"/>
+      </w:pPr>
+      <w:r>
+        <w:rPr>
+          <w:b/>
+        </w:rPr>
+        <w:t>Above 80%:</w:t>
+      </w:r>
+      <w:r>
+        <w:t xml:space="preserve"> Generally reliable for day-to-day categorization.</w:t>
+      </w:r>
+    </w:p>
+    <w:p>
+      <w:pPr>
+        <w:pStyle w:val="ListBullet"/>
+        <w:spacing w:after="80"/>
+      </w:pPr>
+      <w:r>
+        <w:rPr>
+          <w:b/>
+        </w:rPr>
+        <w:t>Above 90%:</w:t>
+      </w:r>
+      <w:r>
+        <w:t xml:space="preserve"> Good enough to run with minimal review.</w:t>
+      </w:r>
+    </w:p>
+    <w:p>
+      <w:pPr>
+        <w:pStyle w:val="Heading3"/>
+      </w:pPr>
+      <w:r>
+        <w:t>24.3 How to build a good model</w:t>
       </w:r>
     </w:p>
     <w:p>
@@ -4186,7 +4302,85 @@
         <w:spacing w:after="80"/>
       </w:pPr>
       <w:r>
-        <w:t>Review the accuracy and category metrics.</w:t>
+        <w:t>Import and categorize real transactions by hand.</w:t>
+      </w:r>
+    </w:p>
+    <w:p>
+      <w:pPr>
+        <w:pStyle w:val="ListNumber"/>
+        <w:spacing w:after="80"/>
+      </w:pPr>
+      <w:r>
+        <w:t>Make sure every category you care about has many examples.</w:t>
+      </w:r>
+    </w:p>
+    <w:p>
+      <w:pPr>
+        <w:pStyle w:val="ListNumber"/>
+        <w:spacing w:after="80"/>
+      </w:pPr>
+      <w:r>
+        <w:t xml:space="preserve">Go to </w:t>
+      </w:r>
+      <w:r>
+        <w:rPr>
+          <w:b/>
+        </w:rPr>
+        <w:t>System → ML Model Management</w:t>
+      </w:r>
+      <w:r>
+        <w:t>.</w:t>
+      </w:r>
+    </w:p>
+    <w:p>
+      <w:pPr>
+        <w:pStyle w:val="ListNumber"/>
+        <w:spacing w:after="80"/>
+      </w:pPr>
+      <w:r>
+        <w:t xml:space="preserve">Click </w:t>
+      </w:r>
+      <w:r>
+        <w:rPr>
+          <w:b/>
+        </w:rPr>
+        <w:t>Train Now</w:t>
+      </w:r>
+      <w:r>
+        <w:t>.</w:t>
+      </w:r>
+    </w:p>
+    <w:p>
+      <w:pPr>
+        <w:pStyle w:val="ListNumber"/>
+        <w:spacing w:after="80"/>
+      </w:pPr>
+      <w:r>
+        <w:t>Review the accuracy and category breakdown.</w:t>
+      </w:r>
+    </w:p>
+    <w:p>
+      <w:pPr>
+        <w:pStyle w:val="ListNumber"/>
+        <w:spacing w:after="80"/>
+      </w:pPr>
+      <w:r>
+        <w:t>If accuracy is low, label more transactions and train again.</w:t>
+      </w:r>
+    </w:p>
+    <w:p>
+      <w:pPr>
+        <w:spacing w:after="160"/>
+        <w:ind w:left="360" w:right="360"/>
+      </w:pPr>
+      <w:r>
+        <w:rPr>
+          <w:b/>
+        </w:rPr>
+        <w:t xml:space="preserve">Tip: </w:t>
+      </w:r>
+      <w:r>
+        <w:t>**Tip:** Rules should do the heavy lifting at first. ML improves over time as you label more data.</w:t>
       </w:r>
     </w:p>
     <w:p>
@@ -4194,7 +4388,7 @@
         <w:pStyle w:val="Heading3"/>
       </w:pPr>
       <w:r>
-        <w:t>24.3 Enable or disable</w:t>
+        <w:t>24.4 How it works technically</w:t>
       </w:r>
     </w:p>
     <w:p>
@@ -4202,6 +4396,32 @@
         <w:spacing w:after="120"/>
       </w:pPr>
       <w:r>
+        <w:t xml:space="preserve">TaxFlow Pro trains a TF-IDF + LogisticRegression classifier on your own labeled transactions. No cloud AI service is used. The model is saved locally as </w:t>
+      </w:r>
+      <w:r>
+        <w:rPr>
+          <w:rFonts w:ascii="Courier New" w:hAnsi="Courier New"/>
+          <w:sz w:val="20"/>
+        </w:rPr>
+        <w:t>local_model.pkl</w:t>
+      </w:r>
+      <w:r>
+        <w:t xml:space="preserve"> and protected by a SHA-256 hash manifest.</w:t>
+      </w:r>
+    </w:p>
+    <w:p>
+      <w:pPr>
+        <w:pStyle w:val="Heading3"/>
+      </w:pPr>
+      <w:r>
+        <w:t>24.5 Enable or disable</w:t>
+      </w:r>
+    </w:p>
+    <w:p>
+      <w:pPr>
+        <w:spacing w:after="120"/>
+      </w:pPr>
+      <w:r>
         <w:t>Toggle ML categorization on or off at any time. When disabled, only rule-based categorization runs.</w:t>
       </w:r>
     </w:p>
@@ -4210,7 +4430,7 @@
         <w:pStyle w:val="Heading3"/>
       </w:pPr>
       <w:r>
-        <w:t>24.4 Model safety</w:t>
+        <w:t>24.6 Model safety</w:t>
       </w:r>
     </w:p>
     <w:p>

</xml_diff>